<commit_message>
Korrigiere Zahlen im Bericht (Confusion-Matrix, CC-Delta, Hamstring-Dice)
- Section 4.6 → 4 (Tippfehler)
- hpt_focal Hamstrings: BfLH ~0.26→~0.21, ST ~0.37→~0.30 (Means, nicht Fold2-Werte)
- +0.089 mit CC → +0.088 (0.3545−0.2663=0.0882)
- Quadrizeps 89–94% → VL/VM/VI 90–95%, RF 29% explizit erwähnt

Co-Authored-By: Claude Sonnet 4.6 <noreply@anthropic.com>
</commit_message>
<xml_diff>
--- a/docs/Report_Sabina_Michelle.docx
+++ b/docs/Report_Sabina_Michelle.docx
@@ -236,7 +236,7 @@
           <w:b/>
           <w:lang w:val="fr-CH"/>
         </w:rPr>
-        <w:t>4.6  Most</w:t>
+        <w:t>4  Most</w:t>
       </w:r>
       <w:proofErr w:type="gramEnd"/>
       <w:r>
@@ -787,7 +787,7 @@
         <w:rPr>
           <w:color w:val="2E5A88"/>
         </w:rPr>
-        <w:t xml:space="preserve">4.6  </w:t>
+        <w:t xml:space="preserve">4  </w:t>
       </w:r>
       <w:r>
         <w:t>Most Relevant Results</w:t>
@@ -848,7 +848,7 @@
         <w:t xml:space="preserve">): </w:t>
       </w:r>
       <w:r>
-        <w:t>hpt_combined erzielt mit 0.308 das höchste Ergebnis (+0.074 vs. Baseline 0.234, +0.089 mit CC), zeigt aber die grösste Fold-Varianz (</w:t>
+        <w:t>hpt_combined erzielt mit 0.308 das höchste Ergebnis (+0.074 vs. Baseline 0.234, +0.088 mit CC), zeigt aber die grösste Fold-Varianz (</w:t>
       </w:r>
       <w:hyperlink w:anchor="DiceOverview" w:history="1">
         <w:r>
@@ -907,7 +907,7 @@
         <w:t xml:space="preserve">): </w:t>
       </w:r>
       <w:r>
-        <w:t>hpt_combined dominiert beim Quadrizeps (VL 0.743, VI 0.716, VM 0.415), hpt_focal ist bei den Hamstrings stärker (BfLH ~0.26, ST ~0.37); BfSH wird von keinem Experiment zuverlässig segmentiert.</w:t>
+        <w:t>hpt_combined dominiert beim Quadrizeps (VL 0.743, VI 0.716, VM 0.415), hpt_focal ist bei den Hamstrings stärker (BfLH ~0.21, ST ~0.30); BfSH wird von keinem Experiment zuverlässig segmentiert.</w:t>
       </w:r>
     </w:p>
     <w:p>
@@ -937,7 +937,7 @@
         <w:t xml:space="preserve">): </w:t>
       </w:r>
       <w:r>
-        <w:t>In der Baseline kollabieren Hamstrings in den Hintergrund oder werden als Quadrizeps prädiziert (BfSH 0% korrekt). hpt_focal hebt BfSH auf 55% korrekt, senkt aber VM von 80% auf 51%. hpt_combined erreicht beim Quadrizeps 89–94% korrekte Voxel, BfSH bleibt jedoch bei 0% (35% als VM, 36% als SM verwechselt).</w:t>
+        <w:t>In der Baseline kollabieren Hamstrings in den Hintergrund oder werden als Quadrizeps prädiziert (BfSH 0% korrekt). hpt_focal hebt BfSH auf 55% korrekt, senkt aber VM von 80% auf 51%. hpt_combined erreicht bei VL, VM und VI 90–95% korrekte Voxel (RF bleibt schwach: 29%), BfSH bleibt bei 0% (35% als VM, 37% als SM verwechselt).</w:t>
       </w:r>
     </w:p>
     <w:p>
@@ -1022,7 +1022,7 @@
         <w:t xml:space="preserve">RQ2 (+0.03): erfüllt. </w:t>
       </w:r>
       <w:r>
-        <w:t>hpt_focal (+0.032) und hpt_combined (+0.074) übertreffen die Baseline signifikant; mit CC steigen die Werte auf +0.028 bzw. +0.089. RQ2 ist mit und ohne Postprocessing erfüllt.</w:t>
+        <w:t>hpt_focal (+0.032) und hpt_combined (+0.074) übertreffen die Baseline signifikant; mit CC steigen die Werte auf +0.028 bzw. +0.088. RQ2 ist mit und ohne Postprocessing erfüllt.</w:t>
       </w:r>
     </w:p>
     <w:p>
@@ -1108,7 +1108,7 @@
         <w:t xml:space="preserve">hpt_combined: </w:t>
       </w:r>
       <w:r>
-        <w:t>Quadrizeps erreicht 89–94% korrekte Voxel, doch BfSH bleibt bei 0%. Klassen-balanciertes Sampling stabilisiert den Quadrizeps, reicht für die schwierigsten Hamstrings aber nicht.</w:t>
+        <w:t>VL, VM, VI erreichen 90–95% korrekte Voxel (RF: 29%), doch BfSH bleibt bei 0%. Klassen-balanciertes Sampling stabilisiert den Quadrizeps, reicht für die schwierigsten Hamstrings aber nicht.</w:t>
       </w:r>
     </w:p>
     <w:p>

</xml_diff>

<commit_message>
Aktualisiere Bericht: neue Version mit Selbstbeurteilung (Note 5.5) und Korrekturen
- Neue Version mit ausführlicher Reflexion und Note 5.5
- Korrekturen: 4.6 → 4, +0.089 → +0.088, Quadrizeps 89-94% → VL/VM/VI 90-95% (RF 29%), 36% SM → 37%
- PDF ebenfalls aktualisiert

Co-Authored-By: Claude Sonnet 4.6 <noreply@anthropic.com>
</commit_message>
<xml_diff>
--- a/docs/Report_Sabina_Michelle.docx
+++ b/docs/Report_Sabina_Michelle.docx
@@ -116,6 +116,18 @@
     <w:p/>
     <w:p/>
     <w:p>
+      <w:pPr>
+        <w:jc w:val="center"/>
+      </w:pPr>
+      <w:r>
+        <w:rPr>
+          <w:color w:val="75858F"/>
+          <w:sz w:val="20"/>
+        </w:rPr>
+        <w:t>Frühjahrssemester 2026</w:t>
+      </w:r>
+    </w:p>
+    <w:p>
       <w:r>
         <w:br w:type="page"/>
       </w:r>
@@ -170,23 +182,16 @@
           <w:tab w:val="right" w:leader="dot" w:pos="9020"/>
         </w:tabs>
         <w:spacing w:after="60"/>
-        <w:rPr>
-          <w:lang w:val="fr-CH"/>
-        </w:rPr>
-      </w:pPr>
-      <w:proofErr w:type="gramStart"/>
+      </w:pPr>
       <w:r>
         <w:rPr>
           <w:b/>
-          <w:lang w:val="fr-CH"/>
         </w:rPr>
         <w:t>2  Data</w:t>
       </w:r>
-      <w:proofErr w:type="gramEnd"/>
       <w:r>
         <w:rPr>
           <w:b/>
-          <w:lang w:val="fr-CH"/>
         </w:rPr>
         <w:tab/>
         <w:t>3</w:t>
@@ -198,23 +203,16 @@
           <w:tab w:val="right" w:leader="dot" w:pos="9020"/>
         </w:tabs>
         <w:spacing w:after="60"/>
-        <w:rPr>
-          <w:lang w:val="fr-CH"/>
-        </w:rPr>
-      </w:pPr>
-      <w:proofErr w:type="gramStart"/>
+      </w:pPr>
       <w:r>
         <w:rPr>
           <w:b/>
-          <w:lang w:val="fr-CH"/>
         </w:rPr>
         <w:t>3  Methods</w:t>
       </w:r>
-      <w:proofErr w:type="gramEnd"/>
       <w:r>
         <w:rPr>
           <w:b/>
-          <w:lang w:val="fr-CH"/>
         </w:rPr>
         <w:tab/>
         <w:t>4</w:t>
@@ -226,30 +224,16 @@
           <w:tab w:val="right" w:leader="dot" w:pos="9020"/>
         </w:tabs>
         <w:spacing w:after="60"/>
-        <w:rPr>
-          <w:lang w:val="fr-CH"/>
-        </w:rPr>
-      </w:pPr>
-      <w:proofErr w:type="gramStart"/>
+      </w:pPr>
       <w:r>
         <w:rPr>
           <w:b/>
-          <w:lang w:val="fr-CH"/>
-        </w:rPr>
-        <w:t>4  Most</w:t>
-      </w:r>
-      <w:proofErr w:type="gramEnd"/>
+        </w:rPr>
+        <w:t>4  Most Relevant Results</w:t>
+      </w:r>
       <w:r>
         <w:rPr>
           <w:b/>
-          <w:lang w:val="fr-CH"/>
-        </w:rPr>
-        <w:t xml:space="preserve"> Relevant Results</w:t>
-      </w:r>
-      <w:r>
-        <w:rPr>
-          <w:b/>
-          <w:lang w:val="fr-CH"/>
         </w:rPr>
         <w:tab/>
         <w:t>4</w:t>
@@ -262,14 +246,12 @@
         </w:tabs>
         <w:spacing w:after="60"/>
       </w:pPr>
-      <w:proofErr w:type="gramStart"/>
       <w:r>
         <w:rPr>
           <w:b/>
         </w:rPr>
         <w:t>5  Discussion</w:t>
       </w:r>
-      <w:proofErr w:type="gramEnd"/>
       <w:r>
         <w:rPr>
           <w:b/>
@@ -471,12 +453,11 @@
       <w:r>
         <w:rPr>
           <w:b/>
-          <w:bCs/>
         </w:rPr>
         <w:t xml:space="preserve">Datensatz: </w:t>
       </w:r>
       <w:r>
-        <w:t>Der aufbereitete Datensatz umfasst 10 Probanden im NIfTI-Format. Jeder Fall enthält ein wassergewichtetes 3D-Volumen und eine Segmentierungsmaske.</w:t>
+        <w:t>10 Probanden (NIfTI); je ein wassergewichtetes, anisotropes 3D-Volumen und eine Maske mit acht rechtsseitigen Muskelklassen plus Hintergrund.</w:t>
       </w:r>
     </w:p>
     <w:p>
@@ -486,12 +467,36 @@
       <w:r>
         <w:rPr>
           <w:b/>
-          <w:bCs/>
+        </w:rPr>
+        <w:t xml:space="preserve">Datencharakteristik: </w:t>
+      </w:r>
+      <w:r>
+        <w:t>Die EDA begründet zwei Entscheidungen. In der Slice-Coverage fallen die linken Masken teils auf ~0 % ab, während die rechte Seite vollständig annotiert ist (</w:t>
+      </w:r>
+      <w:hyperlink w:anchor="SliceCoverage" w:history="1">
+        <w:r>
+          <w:rPr>
+            <w:rStyle w:val="Hyperlink"/>
+          </w:rPr>
+          <w:t>Anhang, Abb. 1</w:t>
+        </w:r>
+      </w:hyperlink>
+      <w:r>
+        <w:t>) — daher nur das rechte Bein. Zudem besteht starkes Klassen-Ungleichgewicht (BfSH ~10× weniger Voxel als VL und geringere Schicht-Abdeckung), was den Hintergrundausschluss und imbalance-robuste Losses motiviert.</w:t>
+      </w:r>
+    </w:p>
+    <w:p>
+      <w:pPr>
+        <w:spacing w:after="120" w:line="276" w:lineRule="auto"/>
+      </w:pPr>
+      <w:r>
+        <w:rPr>
+          <w:b/>
         </w:rPr>
         <w:t xml:space="preserve">Splits: </w:t>
       </w:r>
       <w:r>
-        <w:t>3-Fold Cross-Validation auf Probanden-Ebene (Train 6–7, Val 3–4). Bei n=10 ist kein dediziertes Testset vertretbar; die Folds dienen als Out-of-Fold-Schätzung. Alle Slices eines Probanden liegen in derselben Partition (keine Datenleckage).</w:t>
+        <w:t>3-Fold-CV auf Probanden-Ebene (Train 6–7, Val 3–4); bei n=10 ist kein dediziertes Testset vertretbar, alle Slices eines Probanden liegen in derselben Partition (keine Leckage).</w:t>
       </w:r>
     </w:p>
     <w:p>
@@ -501,12 +506,11 @@
       <w:r>
         <w:rPr>
           <w:b/>
-          <w:bCs/>
         </w:rPr>
         <w:t xml:space="preserve">Preprocessing: </w:t>
       </w:r>
       <w:r>
-        <w:t>H/2-Crop (untere Hälfte, rechtes Bein), Z-Crop auf annotierte Slices ±4, 3D-Bounding-Box ±16 Voxel, Intensitätsnormierung auf [P0.5, P99.5] und [0, 1].</w:t>
+        <w:t>H/2-Crop (rechtes Bein), Z-Crop auf annotierte Slices ±4, 3D-Bounding-Box ±16 Voxel, Intensitätsnormierung [P0.5, P99.5] → [0, 1].</w:t>
       </w:r>
     </w:p>
     <w:p>
@@ -516,69 +520,21 @@
       <w:r>
         <w:rPr>
           <w:b/>
-          <w:bCs/>
         </w:rPr>
         <w:t xml:space="preserve">Limitationen: </w:t>
       </w:r>
       <w:r>
-        <w:t>Kleine Fallzahl (6–7 Trainingsfälle pro Fold) und starkes Klassen-Ungleichgewicht (</w:t>
-      </w:r>
-      <w:proofErr w:type="spellStart"/>
-      <w:r>
-        <w:fldChar w:fldCharType="begin"/>
-      </w:r>
-      <w:r>
-        <w:instrText>HYPERLINK  \l "SliceCoverage"</w:instrText>
-      </w:r>
-      <w:r>
-        <w:fldChar w:fldCharType="separate"/>
-      </w:r>
-      <w:r>
-        <w:rPr>
-          <w:rStyle w:val="Hyperlink"/>
-        </w:rPr>
-        <w:t>BfSH</w:t>
-      </w:r>
-      <w:proofErr w:type="spellEnd"/>
-      <w:r>
-        <w:rPr>
-          <w:rStyle w:val="Hyperlink"/>
-        </w:rPr>
-        <w:t xml:space="preserve"> ~10× kleiner als VL);</w:t>
-      </w:r>
-      <w:r>
-        <w:fldChar w:fldCharType="end"/>
-      </w:r>
-      <w:r>
-        <w:t xml:space="preserve"> Daten aus einer einzigen Studie.</w:t>
-      </w:r>
-    </w:p>
-    <w:p>
-      <w:pPr>
-        <w:rPr>
-          <w:b/>
-          <w:bCs/>
+        <w:t>n=10 (6–7 Trainingsfälle pro Fold) limitiert strukturell; Daten aus einer einzigen Studie.</w:t>
+      </w:r>
+    </w:p>
+    <w:p>
+      <w:pPr>
+        <w:pStyle w:val="berschrift1"/>
+      </w:pPr>
+      <w:r>
+        <w:rPr>
           <w:color w:val="2E5A88"/>
-          <w:sz w:val="28"/>
-          <w:szCs w:val="28"/>
-        </w:rPr>
-      </w:pPr>
-      <w:r>
-        <w:rPr>
-          <w:color w:val="2E5A88"/>
-        </w:rPr>
-        <w:br w:type="page"/>
-      </w:r>
-    </w:p>
-    <w:p>
-      <w:pPr>
-        <w:pStyle w:val="berschrift1"/>
-      </w:pPr>
-      <w:r>
-        <w:rPr>
-          <w:color w:val="2E5A88"/>
-        </w:rPr>
-        <w:lastRenderedPageBreak/>
+        </w:rPr>
         <w:t xml:space="preserve">3  </w:t>
       </w:r>
       <w:r>
@@ -653,6 +609,7 @@
           <w:b/>
           <w:bCs/>
         </w:rPr>
+        <w:lastRenderedPageBreak/>
         <w:t xml:space="preserve">Bayesian Dropout: </w:t>
       </w:r>
       <w:r>
@@ -800,12 +757,11 @@
       <w:r>
         <w:rPr>
           <w:b/>
-          <w:bCs/>
-        </w:rPr>
-        <w:t xml:space="preserve">Overfit-Validierung: </w:t>
-      </w:r>
-      <w:r>
-        <w:t>Der Single-Subject-Overfit (Proband 512) erreicht Dice 0.9011 bei Epoche 244, knapp über der 0.90-Schwelle. Die langsame Konvergenz (</w:t>
+        </w:rPr>
+        <w:t xml:space="preserve">Overfit-Validierung und Forschungsfragen: </w:t>
+      </w:r>
+      <w:r>
+        <w:t xml:space="preserve">Der Single-Subject-Overfit (Proband 512) erreicht einen Dice von 0.9011 (Epoche 244; </w:t>
       </w:r>
       <w:hyperlink w:anchor="OverfitLoss" w:history="1">
         <w:r>
@@ -816,39 +772,29 @@
         </w:r>
       </w:hyperlink>
       <w:r>
-        <w:t>) zeigt, dass die 100-Epochen-CV-Runs budgetlimitiert und nicht voll konvergiert sind. Pipeline und Kapazität sind bestätigt.</w:t>
-      </w:r>
-    </w:p>
-    <w:p>
-      <w:pPr>
-        <w:spacing w:after="120" w:line="276" w:lineRule="auto"/>
-      </w:pPr>
-      <w:r>
-        <w:rPr>
-          <w:b/>
-          <w:bCs/>
-        </w:rPr>
-        <w:t>Dice-Übersicht (</w:t>
+        <w:t>) und belegt, dass Architektur und Pipeline die acht Zielklassen prinzipiell trennen können. Die unter 3-Fold-CV deutlich tieferen Werte sind somit kein Kapazitäts-, sondern ein Generalisierungsproblem im datenarmen Regime. Damit lässt sich RQ1 (mittlerer Dice ≥ 0.60) klar verneinen: Das beste Modell hpt_combined erreicht 0.308 ± 0.061, mit CC 0.355 (</w:t>
       </w:r>
       <w:hyperlink w:anchor="A2" w:history="1">
         <w:r>
           <w:rPr>
             <w:rStyle w:val="Hyperlink"/>
-            <w:b/>
-            <w:bCs/>
           </w:rPr>
           <w:t>Anhang, Tab. A2</w:t>
         </w:r>
       </w:hyperlink>
       <w:r>
+        <w:t>). RQ2 (Verbesserung ≥ +0.03 gegenüber Baseline) ist dagegen erfüllt — hpt_combined übertrifft die Baseline (0.234) um +0.074 (ohne CC) bzw. +0.088 (mit CC).</w:t>
+      </w:r>
+    </w:p>
+    <w:p>
+      <w:pPr>
+        <w:spacing w:after="120" w:line="276" w:lineRule="auto"/>
+      </w:pPr>
+      <w:r>
         <w:rPr>
           <w:b/>
-          <w:bCs/>
-        </w:rPr>
-        <w:t xml:space="preserve">): </w:t>
-      </w:r>
-      <w:r>
-        <w:t>hpt_combined erzielt mit 0.308 das höchste Ergebnis (+0.074 vs. Baseline 0.234, +0.088 mit CC), zeigt aber die grösste Fold-Varianz (</w:t>
+        </w:rPr>
+        <w:t>Experiment-Vergleich (</w:t>
       </w:r>
       <w:hyperlink w:anchor="DiceOverview" w:history="1">
         <w:r>
@@ -859,7 +805,13 @@
         </w:r>
       </w:hyperlink>
       <w:r>
-        <w:t>). hpt_focal (0.266) übertrifft die Baseline ebenfalls; hpt_augmentation und hpt_dropout liegen 40–46% darunter.</w:t>
+        <w:rPr>
+          <w:b/>
+        </w:rPr>
+        <w:t xml:space="preserve">): </w:t>
+      </w:r>
+      <w:r>
+        <w:t>Nur Massnahmen gegen das Klassen-Ungleichgewicht verbessern das Ergebnis. hpt_focal (0.266) hebt selektiv die Hamstrings; der reine Cosine-Scheduler hpt_lr (0.213) bleibt knapp unter der Baseline, und reine Regularisierung ist kontraproduktiv: hpt_dropout (0.130) und hpt_augmentation (0.126) fallen um 40–46 % ab, da sie bei n=10 das ohnehin knappe Signal weiter verdünnen. Erst die Kombination aus Focal-Tversky-Loss und klassen-balanciertem Sampling vereint Quadrizeps-Stärke und Hamstring-Sensitivität. Der Gewinn von +0.074 entspricht jedoch nur etwa dem 1.2-Fachen der Fold-Streuung von hpt_combined (± 0.061); bei drei Folds und n=10 überlappen die Streubereiche, sodass der Vorsprung deskriptiv und ohne gepaarten Signifikanztest nicht inferenzstatistisch abgesichert ist.</w:t>
       </w:r>
     </w:p>
     <w:p>
@@ -869,27 +821,22 @@
       <w:r>
         <w:rPr>
           <w:b/>
-          <w:bCs/>
-        </w:rPr>
-        <w:lastRenderedPageBreak/>
-        <w:t xml:space="preserve">Per-Klassen-Dice (Anhang, </w:t>
+        </w:rPr>
+        <w:t>Anatomisches Muster (</w:t>
       </w:r>
       <w:hyperlink w:anchor="A3" w:history="1">
         <w:r>
           <w:rPr>
             <w:rStyle w:val="Hyperlink"/>
-            <w:b/>
-            <w:bCs/>
           </w:rPr>
-          <w:t>Tab. A3</w:t>
+          <w:t>Anhang, Tab. A3</w:t>
         </w:r>
       </w:hyperlink>
       <w:r>
         <w:rPr>
           <w:b/>
-          <w:bCs/>
-        </w:rPr>
-        <w:t xml:space="preserve"> und </w:t>
+        </w:rPr>
+        <w:t xml:space="preserve">, </w:t>
       </w:r>
       <w:hyperlink w:anchor="PerClass" w:history="1">
         <w:r>
@@ -902,24 +849,15 @@
       <w:r>
         <w:rPr>
           <w:b/>
-          <w:bCs/>
         </w:rPr>
         <w:t xml:space="preserve">): </w:t>
       </w:r>
       <w:r>
-        <w:t>hpt_combined dominiert beim Quadrizeps (VL 0.743, VI 0.716, VM 0.415), hpt_focal ist bei den Hamstrings stärker (BfLH ~0.21, ST ~0.30); BfSH wird von keinem Experiment zuverlässig segmentiert.</w:t>
-      </w:r>
-    </w:p>
-    <w:p>
-      <w:pPr>
-        <w:spacing w:after="120" w:line="276" w:lineRule="auto"/>
-      </w:pPr>
-      <w:r>
-        <w:rPr>
-          <w:b/>
-          <w:bCs/>
-        </w:rPr>
-        <w:t xml:space="preserve">Confusion-Matrix (zeilen-normiert, </w:t>
+        <w:t xml:space="preserve">Die Leistung spaltet sich konsistent — der Quadrizeps ist gut segmentierbar (hpt_combined: VL 0.74, VI 0.72, VM 0.42), die </w:t>
+      </w:r>
+      <w:r>
+        <w:lastRenderedPageBreak/>
+        <w:t>Hamstrings bleiben schwach (BfSH 0.00, BfLH 0.04). Die Confusion-Matrix (</w:t>
       </w:r>
       <w:hyperlink w:anchor="Confusion" w:history="1">
         <w:r>
@@ -930,29 +868,21 @@
         </w:r>
       </w:hyperlink>
       <w:r>
+        <w:t>) lokalisiert die Ursache: In der Baseline werden 0 % der BfSH-Voxel korrekt erkannt und überwiegend als Quadrizeps (VM/RF) prädiziert. hpt_focal hebt BfSH auf 55 %, senkt aber die VM-Korrektheit von 80 % auf 51 % — ein direkter Sensitivitäts-Spezifitäts-Tausch. hpt_combined erreicht bei VL, VM und VI 90–95 % korrekte Voxel (RF: 29 %), verwechselt BfSH jedoch weiterhin (35 % VM, 37 % SM).</w:t>
+      </w:r>
+    </w:p>
+    <w:p>
+      <w:pPr>
+        <w:spacing w:after="120" w:line="276" w:lineRule="auto"/>
+      </w:pPr>
+      <w:r>
         <w:rPr>
           <w:b/>
-          <w:bCs/>
-        </w:rPr>
-        <w:t xml:space="preserve">): </w:t>
-      </w:r>
-      <w:r>
-        <w:t>In der Baseline kollabieren Hamstrings in den Hintergrund oder werden als Quadrizeps prädiziert (BfSH 0% korrekt). hpt_focal hebt BfSH auf 55% korrekt, senkt aber VM von 80% auf 51%. hpt_combined erreicht bei VL, VM und VI 90–95% korrekte Voxel (RF bleibt schwach: 29%), BfSH bleibt bei 0% (35% als VM, 37% als SM verwechselt).</w:t>
-      </w:r>
-    </w:p>
-    <w:p>
-      <w:pPr>
-        <w:spacing w:after="120" w:line="276" w:lineRule="auto"/>
-      </w:pPr>
-      <w:r>
-        <w:rPr>
-          <w:b/>
-          <w:bCs/>
-        </w:rPr>
-        <w:t xml:space="preserve">CC-Postprocessing (hpt_combined): </w:t>
-      </w:r>
-      <w:r>
-        <w:t xml:space="preserve">CC hilft dem Quadrizeps deutlich (VM 0.42→0.53, VI 0.72→0.82), schadet aber den Hamstrings (BfLH 0.04→0.01), da deren grösste Komponente falsch liegt. Der Gewinn (+0.047) ist asymmetrisch; qualitative Vorhersagen in </w:t>
+        </w:rPr>
+        <w:t xml:space="preserve">Postprocessing und Kalibrierung: </w:t>
+      </w:r>
+      <w:r>
+        <w:t>Das CC-Postprocessing wirkt asymmetrisch — es hebt den Quadrizeps deutlich (VM, VI je ≈ +0.1), schadet aber den Hamstrings (BfLH 0.04→0.01), weil deren grösste Komponente bereits falsch liegt; der Netto-Gewinn (+0.047) ist somit quadrizeps-getrieben. Die Unsicherheitsschätzung (hpt_dropout, N=10 MC-Samples) ergibt ein mittleres ECE von 0.070 — das Modell ist nur leicht überconfident. Die qualitativen Vorhersagen (</w:t>
       </w:r>
       <w:hyperlink w:anchor="PredBaseline" w:history="1">
         <w:r>
@@ -963,22 +893,7 @@
         </w:r>
       </w:hyperlink>
       <w:r>
-        <w:t xml:space="preserve"> veranschaulichen den Unterschied.</w:t>
-      </w:r>
-    </w:p>
-    <w:p>
-      <w:pPr>
-        <w:spacing w:after="120" w:line="276" w:lineRule="auto"/>
-      </w:pPr>
-      <w:r>
-        <w:rPr>
-          <w:b/>
-          <w:bCs/>
-        </w:rPr>
-        <w:t xml:space="preserve">ECE (hpt_dropout, N=10): </w:t>
-      </w:r>
-      <w:r>
-        <w:t>Mean ECE = 0.070 über 3 Folds — leicht überconfident, aber nicht stark fehlkalibriert.</w:t>
+        <w:t>) bestätigen das Muster visuell: In der Baseline kollabieren die Hamstrings zu Hintergrund oder Quadrizeps, während hpt_combined den vorderen Quadrizeps nahe an der Ground Truth segmentiert, die Hamstrings hinten aber als undifferenzierten Block ohne Klassentrennung darstellt.</w:t>
       </w:r>
     </w:p>
     <w:p>
@@ -1182,12 +1097,48 @@
       <w:r>
         <w:rPr>
           <w:b/>
-          <w:bCs/>
-        </w:rPr>
-        <w:t xml:space="preserve">Selbstbeurteilung: </w:t>
-      </w:r>
-      <w:r>
-        <w:t>Als Stärken sehen wir das Methodendesign, die Evaluation und die analytische Einordnung — die isolierten Ein-Parameter-Experimente, die vollständig und ehrlich reportierten Metriken inklusive Fehlschläge sowie die diagnostische Herausarbeitung der drei Fehlermodi. Datengrundlage und technische Umsetzung beurteilen wir zurückhaltender: n=10 limitiert strukturell, und der Augmentation-Bug fiel erst nachträglich auf. Anders machen würden wir den Modellvergleich zusätzlich mit einem statistischen Foldtest absichern, qualitative Vorhersage-Overlays ergänzen und die uneinheitliche Metrik-Benennung im Logging früher bereinigen.</w:t>
+        </w:rPr>
+        <w:t xml:space="preserve">Selbstbeurteilung – selbst eingeschätzte Note: 5.5. </w:t>
+      </w:r>
+      <w:r>
+        <w:t>Gemessen am Bewertungsraster (fünf Kompetenzen) schätzen wir die Arbeit auf eine 5.5 ein: Methodendesign, Evaluation und analytische Einordnung sind stark, während wir die Limitationen bei Datengrundlage und Implementierung bewusst reflektieren.</w:t>
+      </w:r>
+    </w:p>
+    <w:p>
+      <w:pPr>
+        <w:spacing w:after="120" w:line="276" w:lineRule="auto"/>
+      </w:pPr>
+      <w:r>
+        <w:rPr>
+          <w:b/>
+        </w:rPr>
+        <w:t xml:space="preserve">Methodendesign: </w:t>
+      </w:r>
+      <w:r>
+        <w:t xml:space="preserve">Die Karpathy-Sequenz (Overfit → Baseline → isolierte Ein-Parameter-Experimente) ist konsequent umgesetzt; jede Entscheidung — kompakte 3D-Architektur, 3-Fold-CV für die kleine Fallzahl, MC-Dropout zur Unsicherheitsschätzung — ist explizit begründet. </w:t>
+      </w:r>
+      <w:r>
+        <w:rPr>
+          <w:b/>
+        </w:rPr>
+        <w:t xml:space="preserve">Evaluation und Analyse: </w:t>
+      </w:r>
+      <w:r>
+        <w:t>Macro-Dice mit Fold-Varianz, Per-Klassen-Dice, Confusion-Matrizen, CC-Diagnostik, ECE und qualitative Vorhersage-Overlays (Abb. 8 und 9) sind vollständig und transparent reportiert, inklusive der Fehlschläge; die drei herausgearbeiteten Fehlermodi (Hintergrund-Kollaps → Inter-Muskel-Verwechslung → selektive Dominanz) liefern eine nicht-generische diagnostische Erkenntnis mit klaren klinischen Grenzen.</w:t>
+      </w:r>
+    </w:p>
+    <w:p>
+      <w:pPr>
+        <w:spacing w:after="120" w:line="276" w:lineRule="auto"/>
+      </w:pPr>
+      <w:r>
+        <w:rPr>
+          <w:b/>
+        </w:rPr>
+        <w:t xml:space="preserve">Datengrundlage und technische Umsetzung: </w:t>
+      </w:r>
+      <w:r>
+        <w:t>Use Case, Splits und EDA sind sauber, doch n=10 limitiert strukturell; die Pipeline ist korrekt und durch den Overfit validiert, der Augmentation-Bug wurde jedoch erst nachträglich erkannt. Eine statistische Absicherung des Modellvergleichs (gepaarter Foldtest) würde die Evaluation zusätzlich härten. Insgesamt überwiegen die Stärken in Methodik, Evaluation und Analyse die Limitationen deutlich, weshalb wir die Arbeit bei einer 5.5 sehen.</w:t>
       </w:r>
     </w:p>
     <w:p>

</xml_diff>